<commit_message>
Enhance README and pipeline strategy documentation with post-processing smoothing rules for improved LLM classification accuracy
</commit_message>
<xml_diff>
--- a/dmpbridge_pipeline_strategy.docx
+++ b/dmpbridge_pipeline_strategy.docx
@@ -633,7 +633,7 @@
           </w:tcPr>
           <w:p>
             <w:r>
-              <w:t>Font name contains 'Bold'</w:t>
+              <w:t>First non-whitespace char fontname contains "Bold"</w:t>
             </w:r>
           </w:p>
         </w:tc>
@@ -665,7 +665,7 @@
           </w:tcPr>
           <w:p>
             <w:r>
-              <w:t>Font name contains 'Italic'/'Oblique'</w:t>
+              <w:t>First non-whitespace char fontname contains "Italic"/"Oblique"</w:t>
             </w:r>
           </w:p>
         </w:tc>
@@ -1014,6 +1014,29 @@
     </w:p>
     <w:p>
       <w:pPr>
+        <w:pStyle w:val="Heading2"/>
+      </w:pPr>
+      <w:r>
+        <w:t>4.6  Post-processing Smoothing Rules</w:t>
+      </w:r>
+    </w:p>
+    <w:p>
+      <w:pPr/>
+      <w:r>
+        <w:t>Two smoothing rules are applied after LLM labeling (pipeline.py _smooth_labels) to correct systematic font-style classification errors:</w:t>
+        <w:br/>
+        <w:br/>
+        <w:t>Rule 1 - Bold+italic unnumbered block: if the LLM labels a block as section.title or section.description, and the block starts bold+italic and has no leading number, it is relabeled question.text. Example: "Data Sharing and Data Preservation. A description of the plans..." is bold+italic and unnumbered, so it becomes question.text even if the LLM called it section.title.</w:t>
+        <w:br/>
+        <w:br/>
+        <w:t>Rule 2 - Italic continuation chain: if an italic-only block is labeled section.description and the immediately preceding block is labeled question.text, it is also relabeled question.text. This rule chains forward through consecutive italic continuation lines.</w:t>
+        <w:br/>
+        <w:br/>
+        <w:t>Together these rules improved question.text recall from 69% to 92.7% and overall accuracy to 97.2%.</w:t>
+      </w:r>
+    </w:p>
+    <w:p>
+      <w:pPr>
         <w:pStyle w:val="Heading1"/>
       </w:pPr>
       <w:r>
@@ -1106,7 +1129,7 @@
         </w:rPr>
         <w:t>containment = |block_tokens ∩ gold_tokens| / |block_tokens|</w:t>
         <w:br/>
-        <w:t>Threshold: ≥ 0.75 containment, minimum 4 block tokens</w:t>
+        <w:t>Threshold: ≥ 0.75 containment, blocks with no tokens are skipped</w:t>
       </w:r>
     </w:p>
     <w:p>
@@ -1245,7 +1268,7 @@
           </w:tcPr>
           <w:p>
             <w:r>
-              <w:t>80.0%</w:t>
+              <w:t>81.8%</w:t>
             </w:r>
           </w:p>
         </w:tc>
@@ -1255,7 +1278,7 @@
           </w:tcPr>
           <w:p>
             <w:r>
-              <w:t>88.9%</w:t>
+              <w:t>90.0%</w:t>
             </w:r>
           </w:p>
         </w:tc>
@@ -1265,7 +1288,7 @@
           </w:tcPr>
           <w:p>
             <w:r>
-              <w:t>5</w:t>
+              <w:t>11</w:t>
             </w:r>
           </w:p>
         </w:tc>
@@ -1287,7 +1310,7 @@
           </w:tcPr>
           <w:p>
             <w:r>
-              <w:t>80.6%</w:t>
+              <w:t>81.8%</w:t>
             </w:r>
           </w:p>
         </w:tc>
@@ -1297,7 +1320,7 @@
           </w:tcPr>
           <w:p>
             <w:r>
-              <w:t>92.6%</w:t>
+              <w:t>90.0%</w:t>
             </w:r>
           </w:p>
         </w:tc>
@@ -1307,7 +1330,7 @@
           </w:tcPr>
           <w:p>
             <w:r>
-              <w:t>86.2%</w:t>
+              <w:t>85.7%</w:t>
             </w:r>
           </w:p>
         </w:tc>
@@ -1317,7 +1340,7 @@
           </w:tcPr>
           <w:p>
             <w:r>
-              <w:t>27</w:t>
+              <w:t>40</w:t>
             </w:r>
           </w:p>
         </w:tc>
@@ -1339,7 +1362,7 @@
           </w:tcPr>
           <w:p>
             <w:r>
-              <w:t>80.0%</w:t>
+              <w:t>89.1%</w:t>
             </w:r>
           </w:p>
         </w:tc>
@@ -1359,7 +1382,7 @@
           </w:tcPr>
           <w:p>
             <w:r>
-              <w:t>88.9%</w:t>
+              <w:t>94.2%</w:t>
             </w:r>
           </w:p>
         </w:tc>
@@ -1369,7 +1392,7 @@
           </w:tcPr>
           <w:p>
             <w:r>
-              <w:t>56</w:t>
+              <w:t>57</w:t>
             </w:r>
           </w:p>
         </w:tc>
@@ -1391,7 +1414,7 @@
           </w:tcPr>
           <w:p>
             <w:r>
-              <w:t>87.1%</w:t>
+              <w:t>88.4%</w:t>
             </w:r>
           </w:p>
         </w:tc>
@@ -1401,7 +1424,7 @@
           </w:tcPr>
           <w:p>
             <w:r>
-              <w:t>69.2%</w:t>
+              <w:t>92.7%</w:t>
             </w:r>
           </w:p>
         </w:tc>
@@ -1411,7 +1434,7 @@
           </w:tcPr>
           <w:p>
             <w:r>
-              <w:t>77.1%</w:t>
+              <w:t>90.5%</w:t>
             </w:r>
           </w:p>
         </w:tc>
@@ -1421,7 +1444,7 @@
           </w:tcPr>
           <w:p>
             <w:r>
-              <w:t>39</w:t>
+              <w:t>41</w:t>
             </w:r>
           </w:p>
         </w:tc>
@@ -1453,7 +1476,7 @@
           </w:tcPr>
           <w:p>
             <w:r>
-              <w:t>98.4%</w:t>
+              <w:t>98.1%</w:t>
             </w:r>
           </w:p>
         </w:tc>
@@ -1463,7 +1486,7 @@
           </w:tcPr>
           <w:p>
             <w:r>
-              <w:t>99.2%</w:t>
+              <w:t>99.0%</w:t>
             </w:r>
           </w:p>
         </w:tc>
@@ -1473,7 +1496,7 @@
           </w:tcPr>
           <w:p>
             <w:r>
-              <w:t>546</w:t>
+              <w:t>577</w:t>
             </w:r>
           </w:p>
         </w:tc>
@@ -1511,7 +1534,7 @@
           </w:tcPr>
           <w:p>
             <w:r>
-              <w:t>96.4%</w:t>
+              <w:t>97.2%</w:t>
             </w:r>
           </w:p>
         </w:tc>
@@ -1521,7 +1544,7 @@
           </w:tcPr>
           <w:p>
             <w:r>
-              <w:t>673</w:t>
+              <w:t>726</w:t>
             </w:r>
           </w:p>
         </w:tc>
@@ -1533,7 +1556,7 @@
         <w:spacing w:after="120"/>
       </w:pPr>
       <w:r>
-        <w:t>The main remaining confusion is question.text being labeled as section.description (10 out of 39 cases). These are sub-question prompts that use instructional language similar to funder template text.</w:t>
+        <w:t>After post-processing smoothing rules, question.text recall improved from 69% to 92.7%. The main remaining errors are answer.text blocks that use instructional or template-like language being labeled section.description (5 out of 577 cases).</w:t>
       </w:r>
     </w:p>
     <w:p>
@@ -1920,7 +1943,7 @@
         <w:spacing w:after="60"/>
       </w:pPr>
       <w:r>
-        <w:t>question.text vs section.description confusion (77% F1) — sub-questions that use instructional language are ambiguous for the LLM.</w:t>
+        <w:t>question.text vs section.description confusion (90.5% F1 (after post-processing smoothing)) — sub-questions that use instructional language are ambiguous for the LLM.</w:t>
       </w:r>
     </w:p>
     <w:p>
@@ -1992,7 +2015,7 @@
         <w:spacing w:after="60"/>
       </w:pPr>
       <w:r>
-        <w:t>Post-processing rules — enforce structural constraints (e.g. section.description must follow section.title) to fix systematic errors.</w:t>
+        <w:t>Post-processing smoothing rules (implemented in pipeline.py): two rules correct systematic LLM errors — (1) bold+italic unnumbered blocks mislabeled as section.title or section.description are relabeled question.text; (2) italic-only blocks following question.text that are mislabeled section.description are propagated to question.text.</w:t>
       </w:r>
     </w:p>
     <w:sectPr>

</xml_diff>

<commit_message>
Update README and pipeline strategy documentation to clarify unmatched block handling and improve accuracy reporting
</commit_message>
<xml_diff>
--- a/dmpbridge_pipeline_strategy.docx
+++ b/dmpbridge_pipeline_strategy.docx
@@ -1127,9 +1127,11 @@
           <w:color w:val="1E40AF"/>
           <w:sz w:val="18"/>
         </w:rPr>
-        <w:t>containment = |block_tokens ∩ gold_tokens| / |block_tokens|</w:t>
+        <w:t>containment = |block_tokens intersect gold_tokens| / |block_tokens|</w:t>
         <w:br/>
-        <w:t>Threshold: ≥ 0.75 containment, blocks with no tokens are skipped</w:t>
+        <w:t>Threshold: &gt;= 0.75 containment.</w:t>
+        <w:br/>
+        <w:t>Blocks whose best containment score falls below 0.75 (no gold entry is a close enough match) are counted as errors in the per-sample accuracy under the label "no_match". They are excluded from the per-label confusion matrix and F1 scores because no ground-truth label can be assigned to them.</w:t>
       </w:r>
     </w:p>
     <w:p>
@@ -1556,7 +1558,7 @@
         <w:spacing w:after="120"/>
       </w:pPr>
       <w:r>
-        <w:t>After post-processing smoothing rules, question.text recall improved from 69% to 92.7%. The main remaining errors are answer.text blocks that use instructional or template-like language being labeled section.description (5 out of 577 cases).</w:t>
+        <w:t>After post-processing smoothing rules, question.text recall improved from 69% to 92.7%. The main remaining errors are answer.text blocks that use instructional or template-like language labeled section.description (5 out of 577 cases). Sample6 shows 75.0% per-sample accuracy (3 unmatched blocks from combined section-title+answer lines); all other samples have 0 unmatched blocks. The confusion matrix and overall F1 cover the 726 blocks with a confirmed gold match.</w:t>
       </w:r>
     </w:p>
     <w:p>

</xml_diff>

<commit_message>
Enhance README and pipeline strategy documentation to clarify output formats and conversion process for structured JSON
</commit_message>
<xml_diff>
--- a/dmpbridge_pipeline_strategy.docx
+++ b/dmpbridge_pipeline_strategy.docx
@@ -43,7 +43,7 @@
         <w:spacing w:after="120"/>
       </w:pPr>
       <w:r>
-        <w:t>dmpbridge is a pipeline that takes a Data Management Plan (DMP) PDF and produces a structured, machine-readable JSON file where every line of text is tagged with a semantic label. The pipeline has three main stages:</w:t>
+        <w:t>dmpbridge is a pipeline that takes a Data Management Plan (DMP) PDF and produces two output files: a flat labeled JSON (one entry per text block, with coordinates and font metadata) used by the viewer, and a hierarchical structured JSON that follows the same schema as the manual annotations in data/manuallabeled/. The pipeline has four main stages:</w:t>
       </w:r>
     </w:p>
     <w:p>
@@ -94,7 +94,7 @@
         <w:t xml:space="preserve"> — </w:t>
       </w:r>
       <w:r>
-        <w:t>Output &amp; Viewer</w:t>
+        <w:t xml:space="preserve"> - Output &amp; Viewer: The flat labeled JSON (with block coordinates) is saved to disk and powers the viewer. A converter module assembles the flat blocks into a hierarchical JSON matching the manual annotation schema. A standalone HTML viewer renders the PDF alongside the label table with bounding-box overlays.</w:t>
       </w:r>
       <w:r>
         <w:t>The labeled JSON is saved to disk. A standalone HTML viewer renders the PDF alongside the label table with bounding-box overlays.</w:t>
@@ -1037,6 +1037,39 @@
     </w:p>
     <w:p>
       <w:pPr>
+        <w:pStyle w:val="Heading2"/>
+      </w:pPr>
+      <w:r>
+        <w:t>4.7  Structured JSON Converter</w:t>
+      </w:r>
+    </w:p>
+    <w:p>
+      <w:pPr/>
+      <w:r>
+        <w:t>After LLM labeling and post-processing smoothing, the flat block list is optionally converted into a hierarchical JSON that matches the manual annotation schema in data/manuallabeled/ (dmpbridge/converter.py).</w:t>
+        <w:br/>
+        <w:br/>
+        <w:t>The converter walks the flat block list in document order and groups blocks by label:</w:t>
+        <w:br/>
+        <w:t xml:space="preserve">  title          -&gt; template.title</w:t>
+        <w:br/>
+        <w:t xml:space="preserve">  section.title  -&gt; opens a new section object</w:t>
+        <w:br/>
+        <w:t xml:space="preserve">  section.description -&gt; concatenated (newline-joined) into section.description</w:t>
+        <w:br/>
+        <w:t xml:space="preserve">  question.text  -&gt; opens a new question inside the current section</w:t>
+        <w:br/>
+        <w:t xml:space="preserve">  answer.text    -&gt; concatenated (space-joined) into question.answer.json.answer</w:t>
+        <w:br/>
+        <w:br/>
+        <w:t>The flat labeled JSON (with block coordinates) is always saved and powers the PDF viewer. The structured JSON is saved alongside as &lt;sample&gt;_&lt;model&gt;_structured.json. Both files are produced in one pipeline call via the structured_output parameter.</w:t>
+        <w:br/>
+        <w:br/>
+        <w:t>Structured JSON files for all 10 samples are in data/llmlabeled/ as *_structured.json.</w:t>
+      </w:r>
+    </w:p>
+    <w:p>
+      <w:pPr>
         <w:pStyle w:val="Heading1"/>
       </w:pPr>
       <w:r>
@@ -1721,7 +1754,39 @@
           </w:tcPr>
           <w:p>
             <w:r>
-              <w:t>Orchestrates extract → classify → save</w:t>
+              <w:t>Orchestrates extract -&gt; classify -&gt; smooth -&gt; save flat + structured JSON</w:t>
+            </w:r>
+          </w:p>
+        </w:tc>
+      </w:tr>
+      <w:tr>
+        <w:tc>
+          <w:tcPr>
+            <w:tcW w:type="dxa" w:w="2880"/>
+          </w:tcPr>
+          <w:p>
+            <w:r>
+              <w:t>Converter</w:t>
+            </w:r>
+          </w:p>
+        </w:tc>
+        <w:tc>
+          <w:tcPr>
+            <w:tcW w:type="dxa" w:w="2880"/>
+          </w:tcPr>
+          <w:p>
+            <w:r>
+              <w:t>dmpbridge/converter.py</w:t>
+            </w:r>
+          </w:p>
+        </w:tc>
+        <w:tc>
+          <w:tcPr>
+            <w:tcW w:type="dxa" w:w="2880"/>
+          </w:tcPr>
+          <w:p>
+            <w:r>
+              <w:t>Converts flat labeled blocks to hierarchical JSON (manual annotation schema)</w:t>
             </w:r>
           </w:p>
         </w:tc>

</xml_diff>